<commit_message>
added ATC4 and 5
</commit_message>
<xml_diff>
--- a/Output/MedicatieReview_Argusvlinder.docx
+++ b/Output/MedicatieReview_Argusvlinder.docx
@@ -264,7 +264,7 @@
               <w:rPr>
                 <w:b/>
               </w:rPr>
-              <w:t>Opmerking Medimo</w:t>
+              <w:t>Opmerking in Medimo</w:t>
             </w:r>
           </w:p>
         </w:tc>
@@ -447,7 +447,7 @@
               <w:rPr>
                 <w:b/>
               </w:rPr>
-              <w:t>Opmerking Medimo</w:t>
+              <w:t>Opmerking in Medimo</w:t>
             </w:r>
           </w:p>
         </w:tc>
@@ -632,7 +632,7 @@
               <w:rPr>
                 <w:b/>
               </w:rPr>
-              <w:t>Opmerking Medimo</w:t>
+              <w:t>Opmerking in Medimo</w:t>
             </w:r>
           </w:p>
         </w:tc>
@@ -777,7 +777,7 @@
               <w:rPr>
                 <w:b/>
               </w:rPr>
-              <w:t>Opmerking Medimo</w:t>
+              <w:t>Opmerking in Medimo</w:t>
             </w:r>
           </w:p>
         </w:tc>
@@ -920,7 +920,7 @@
               <w:rPr>
                 <w:b/>
               </w:rPr>
-              <w:t>Opmerking Medimo</w:t>
+              <w:t>Opmerking in Medimo</w:t>
             </w:r>
           </w:p>
         </w:tc>
@@ -1103,7 +1103,7 @@
               <w:rPr>
                 <w:b/>
               </w:rPr>
-              <w:t>Opmerking Medimo</w:t>
+              <w:t>Opmerking in Medimo</w:t>
             </w:r>
           </w:p>
         </w:tc>
@@ -1427,7 +1427,7 @@
               <w:rPr>
                 <w:b/>
               </w:rPr>
-              <w:t>Opmerking Medimo</w:t>
+              <w:t>Opmerking in Medimo</w:t>
             </w:r>
           </w:p>
         </w:tc>
@@ -1572,7 +1572,7 @@
               <w:rPr>
                 <w:b/>
               </w:rPr>
-              <w:t>Opmerking Medimo</w:t>
+              <w:t>Opmerking in Medimo</w:t>
             </w:r>
           </w:p>
         </w:tc>
@@ -1755,7 +1755,7 @@
               <w:rPr>
                 <w:b/>
               </w:rPr>
-              <w:t>Opmerking Medimo</w:t>
+              <w:t>Opmerking in Medimo</w:t>
             </w:r>
           </w:p>
         </w:tc>
@@ -1898,7 +1898,7 @@
               <w:rPr>
                 <w:b/>
               </w:rPr>
-              <w:t>Opmerking Medimo</w:t>
+              <w:t>Opmerking in Medimo</w:t>
             </w:r>
           </w:p>
         </w:tc>
@@ -2083,7 +2083,7 @@
               <w:rPr>
                 <w:b/>
               </w:rPr>
-              <w:t>Opmerking Medimo</w:t>
+              <w:t>Opmerking in Medimo</w:t>
             </w:r>
           </w:p>
         </w:tc>
@@ -2266,7 +2266,7 @@
               <w:rPr>
                 <w:b/>
               </w:rPr>
-              <w:t>Opmerking Medimo</w:t>
+              <w:t>Opmerking in Medimo</w:t>
             </w:r>
           </w:p>
         </w:tc>
@@ -2590,7 +2590,7 @@
               <w:rPr>
                 <w:b/>
               </w:rPr>
-              <w:t>Opmerking Medimo</w:t>
+              <w:t>Opmerking in Medimo</w:t>
             </w:r>
           </w:p>
         </w:tc>
@@ -2733,7 +2733,7 @@
               <w:rPr>
                 <w:b/>
               </w:rPr>
-              <w:t>Opmerking Medimo</w:t>
+              <w:t>Opmerking in Medimo</w:t>
             </w:r>
           </w:p>
         </w:tc>
@@ -2876,7 +2876,7 @@
               <w:rPr>
                 <w:b/>
               </w:rPr>
-              <w:t>Opmerking Medimo</w:t>
+              <w:t>Opmerking in Medimo</w:t>
             </w:r>
           </w:p>
         </w:tc>
@@ -3059,7 +3059,7 @@
               <w:rPr>
                 <w:b/>
               </w:rPr>
-              <w:t>Opmerking Medimo</w:t>
+              <w:t>Opmerking in Medimo</w:t>
             </w:r>
           </w:p>
         </w:tc>
@@ -3204,7 +3204,7 @@
               <w:rPr>
                 <w:b/>
               </w:rPr>
-              <w:t>Opmerking Medimo</w:t>
+              <w:t>Opmerking in Medimo</w:t>
             </w:r>
           </w:p>
         </w:tc>
@@ -3391,7 +3391,7 @@
               <w:rPr>
                 <w:b/>
               </w:rPr>
-              <w:t>Opmerking Medimo</w:t>
+              <w:t>Opmerking in Medimo</w:t>
             </w:r>
           </w:p>
         </w:tc>
@@ -3536,7 +3536,7 @@
               <w:rPr>
                 <w:b/>
               </w:rPr>
-              <w:t>Opmerking Medimo</w:t>
+              <w:t>Opmerking in Medimo</w:t>
             </w:r>
           </w:p>
         </w:tc>
@@ -3924,7 +3924,7 @@
               <w:rPr>
                 <w:b/>
               </w:rPr>
-              <w:t>Opmerking Medimo</w:t>
+              <w:t>Opmerking in Medimo</w:t>
             </w:r>
           </w:p>
         </w:tc>
@@ -4069,7 +4069,7 @@
               <w:rPr>
                 <w:b/>
               </w:rPr>
-              <w:t>Opmerking Medimo</w:t>
+              <w:t>Opmerking in Medimo</w:t>
             </w:r>
           </w:p>
         </w:tc>
@@ -4292,7 +4292,7 @@
               <w:rPr>
                 <w:b/>
               </w:rPr>
-              <w:t>Opmerking Medimo</w:t>
+              <w:t>Opmerking in Medimo</w:t>
             </w:r>
           </w:p>
         </w:tc>
@@ -4435,7 +4435,7 @@
               <w:rPr>
                 <w:b/>
               </w:rPr>
-              <w:t>Opmerking Medimo</w:t>
+              <w:t>Opmerking in Medimo</w:t>
             </w:r>
           </w:p>
         </w:tc>
@@ -4658,7 +4658,7 @@
               <w:rPr>
                 <w:b/>
               </w:rPr>
-              <w:t>Opmerking Medimo</w:t>
+              <w:t>Opmerking in Medimo</w:t>
             </w:r>
           </w:p>
         </w:tc>
@@ -4801,7 +4801,7 @@
               <w:rPr>
                 <w:b/>
               </w:rPr>
-              <w:t>Opmerking Medimo</w:t>
+              <w:t>Opmerking in Medimo</w:t>
             </w:r>
           </w:p>
         </w:tc>
@@ -4986,7 +4986,7 @@
               <w:rPr>
                 <w:b/>
               </w:rPr>
-              <w:t>Opmerking Medimo</w:t>
+              <w:t>Opmerking in Medimo</w:t>
             </w:r>
           </w:p>
         </w:tc>
@@ -5169,7 +5169,7 @@
               <w:rPr>
                 <w:b/>
               </w:rPr>
-              <w:t>Opmerking Medimo</w:t>
+              <w:t>Opmerking in Medimo</w:t>
             </w:r>
           </w:p>
         </w:tc>
@@ -5559,7 +5559,7 @@
               <w:rPr>
                 <w:b/>
               </w:rPr>
-              <w:t>Opmerking Medimo</w:t>
+              <w:t>Opmerking in Medimo</w:t>
             </w:r>
           </w:p>
         </w:tc>
@@ -5824,7 +5824,7 @@
               <w:rPr>
                 <w:b/>
               </w:rPr>
-              <w:t>Opmerking Medimo</w:t>
+              <w:t>Opmerking in Medimo</w:t>
             </w:r>
           </w:p>
         </w:tc>
@@ -6011,7 +6011,7 @@
               <w:rPr>
                 <w:b/>
               </w:rPr>
-              <w:t>Opmerking Medimo</w:t>
+              <w:t>Opmerking in Medimo</w:t>
             </w:r>
           </w:p>
         </w:tc>
@@ -6156,7 +6156,7 @@
               <w:rPr>
                 <w:b/>
               </w:rPr>
-              <w:t>Opmerking Medimo</w:t>
+              <w:t>Opmerking in Medimo</w:t>
             </w:r>
           </w:p>
         </w:tc>
@@ -6339,7 +6339,7 @@
               <w:rPr>
                 <w:b/>
               </w:rPr>
-              <w:t>Opmerking Medimo</w:t>
+              <w:t>Opmerking in Medimo</w:t>
             </w:r>
           </w:p>
         </w:tc>
@@ -6524,7 +6524,7 @@
               <w:rPr>
                 <w:b/>
               </w:rPr>
-              <w:t>Opmerking Medimo</w:t>
+              <w:t>Opmerking in Medimo</w:t>
             </w:r>
           </w:p>
         </w:tc>
@@ -6890,7 +6890,7 @@
               <w:rPr>
                 <w:b/>
               </w:rPr>
-              <w:t>Opmerking Medimo</w:t>
+              <w:t>Opmerking in Medimo</w:t>
             </w:r>
           </w:p>
         </w:tc>
@@ -7075,7 +7075,7 @@
               <w:rPr>
                 <w:b/>
               </w:rPr>
-              <w:t>Opmerking Medimo</w:t>
+              <w:t>Opmerking in Medimo</w:t>
             </w:r>
           </w:p>
         </w:tc>
@@ -7424,7 +7424,7 @@
               <w:rPr>
                 <w:b/>
               </w:rPr>
-              <w:t>Opmerking Medimo</w:t>
+              <w:t>Opmerking in Medimo</w:t>
             </w:r>
           </w:p>
         </w:tc>
@@ -7567,7 +7567,7 @@
               <w:rPr>
                 <w:b/>
               </w:rPr>
-              <w:t>Opmerking Medimo</w:t>
+              <w:t>Opmerking in Medimo</w:t>
             </w:r>
           </w:p>
         </w:tc>
@@ -7792,7 +7792,7 @@
               <w:rPr>
                 <w:b/>
               </w:rPr>
-              <w:t>Opmerking Medimo</w:t>
+              <w:t>Opmerking in Medimo</w:t>
             </w:r>
           </w:p>
         </w:tc>
@@ -7937,7 +7937,7 @@
               <w:rPr>
                 <w:b/>
               </w:rPr>
-              <w:t>Opmerking Medimo</w:t>
+              <w:t>Opmerking in Medimo</w:t>
             </w:r>
           </w:p>
         </w:tc>
@@ -8082,7 +8082,7 @@
               <w:rPr>
                 <w:b/>
               </w:rPr>
-              <w:t>Opmerking Medimo</w:t>
+              <w:t>Opmerking in Medimo</w:t>
             </w:r>
           </w:p>
         </w:tc>
@@ -8265,7 +8265,7 @@
               <w:rPr>
                 <w:b/>
               </w:rPr>
-              <w:t>Opmerking Medimo</w:t>
+              <w:t>Opmerking in Medimo</w:t>
             </w:r>
           </w:p>
         </w:tc>
@@ -8589,7 +8589,7 @@
               <w:rPr>
                 <w:b/>
               </w:rPr>
-              <w:t>Opmerking Medimo</w:t>
+              <w:t>Opmerking in Medimo</w:t>
             </w:r>
           </w:p>
         </w:tc>
@@ -8814,7 +8814,7 @@
               <w:rPr>
                 <w:b/>
               </w:rPr>
-              <w:t>Opmerking Medimo</w:t>
+              <w:t>Opmerking in Medimo</w:t>
             </w:r>
           </w:p>
         </w:tc>
@@ -8999,7 +8999,7 @@
               <w:rPr>
                 <w:b/>
               </w:rPr>
-              <w:t>Opmerking Medimo</w:t>
+              <w:t>Opmerking in Medimo</w:t>
             </w:r>
           </w:p>
         </w:tc>
@@ -9144,7 +9144,7 @@
               <w:rPr>
                 <w:b/>
               </w:rPr>
-              <w:t>Opmerking Medimo</w:t>
+              <w:t>Opmerking in Medimo</w:t>
             </w:r>
           </w:p>
         </w:tc>
@@ -9289,7 +9289,7 @@
               <w:rPr>
                 <w:b/>
               </w:rPr>
-              <w:t>Opmerking Medimo</w:t>
+              <w:t>Opmerking in Medimo</w:t>
             </w:r>
           </w:p>
         </w:tc>
@@ -9472,7 +9472,7 @@
               <w:rPr>
                 <w:b/>
               </w:rPr>
-              <w:t>Opmerking Medimo</w:t>
+              <w:t>Opmerking in Medimo</w:t>
             </w:r>
           </w:p>
         </w:tc>
@@ -9816,7 +9816,7 @@
               <w:rPr>
                 <w:b/>
               </w:rPr>
-              <w:t>Opmerking Medimo</w:t>
+              <w:t>Opmerking in Medimo</w:t>
             </w:r>
           </w:p>
         </w:tc>
@@ -10001,7 +10001,7 @@
               <w:rPr>
                 <w:b/>
               </w:rPr>
-              <w:t>Opmerking Medimo</w:t>
+              <w:t>Opmerking in Medimo</w:t>
             </w:r>
           </w:p>
         </w:tc>
@@ -10146,7 +10146,7 @@
               <w:rPr>
                 <w:b/>
               </w:rPr>
-              <w:t>Opmerking Medimo</w:t>
+              <w:t>Opmerking in Medimo</w:t>
             </w:r>
           </w:p>
         </w:tc>
@@ -10289,7 +10289,7 @@
               <w:rPr>
                 <w:b/>
               </w:rPr>
-              <w:t>Opmerking Medimo</w:t>
+              <w:t>Opmerking in Medimo</w:t>
             </w:r>
           </w:p>
         </w:tc>
@@ -10472,7 +10472,7 @@
               <w:rPr>
                 <w:b/>
               </w:rPr>
-              <w:t>Opmerking Medimo</w:t>
+              <w:t>Opmerking in Medimo</w:t>
             </w:r>
           </w:p>
         </w:tc>
@@ -10816,7 +10816,7 @@
               <w:rPr>
                 <w:b/>
               </w:rPr>
-              <w:t>Opmerking Medimo</w:t>
+              <w:t>Opmerking in Medimo</w:t>
             </w:r>
           </w:p>
         </w:tc>
@@ -10959,7 +10959,7 @@
               <w:rPr>
                 <w:b/>
               </w:rPr>
-              <w:t>Opmerking Medimo</w:t>
+              <w:t>Opmerking in Medimo</w:t>
             </w:r>
           </w:p>
         </w:tc>
@@ -11144,7 +11144,7 @@
               <w:rPr>
                 <w:b/>
               </w:rPr>
-              <w:t>Opmerking Medimo</w:t>
+              <w:t>Opmerking in Medimo</w:t>
             </w:r>
           </w:p>
         </w:tc>
@@ -11287,7 +11287,7 @@
               <w:rPr>
                 <w:b/>
               </w:rPr>
-              <w:t>Opmerking Medimo</w:t>
+              <w:t>Opmerking in Medimo</w:t>
             </w:r>
           </w:p>
         </w:tc>
@@ -11472,7 +11472,7 @@
               <w:rPr>
                 <w:b/>
               </w:rPr>
-              <w:t>Opmerking Medimo</w:t>
+              <w:t>Opmerking in Medimo</w:t>
             </w:r>
           </w:p>
         </w:tc>
@@ -11657,7 +11657,7 @@
               <w:rPr>
                 <w:b/>
               </w:rPr>
-              <w:t>Opmerking Medimo</w:t>
+              <w:t>Opmerking in Medimo</w:t>
             </w:r>
           </w:p>
         </w:tc>
@@ -11800,7 +11800,7 @@
               <w:rPr>
                 <w:b/>
               </w:rPr>
-              <w:t>Opmerking Medimo</w:t>
+              <w:t>Opmerking in Medimo</w:t>
             </w:r>
           </w:p>
         </w:tc>
@@ -11945,7 +11945,7 @@
               <w:rPr>
                 <w:b/>
               </w:rPr>
-              <w:t>Opmerking Medimo</w:t>
+              <w:t>Opmerking in Medimo</w:t>
             </w:r>
           </w:p>
         </w:tc>
@@ -12132,7 +12132,7 @@
               <w:rPr>
                 <w:b/>
               </w:rPr>
-              <w:t>Opmerking Medimo</w:t>
+              <w:t>Opmerking in Medimo</w:t>
             </w:r>
           </w:p>
         </w:tc>
@@ -12319,7 +12319,7 @@
               <w:rPr>
                 <w:b/>
               </w:rPr>
-              <w:t>Opmerking Medimo</w:t>
+              <w:t>Opmerking in Medimo</w:t>
             </w:r>
           </w:p>
         </w:tc>
@@ -12502,7 +12502,7 @@
               <w:rPr>
                 <w:b/>
               </w:rPr>
-              <w:t>Opmerking Medimo</w:t>
+              <w:t>Opmerking in Medimo</w:t>
             </w:r>
           </w:p>
         </w:tc>
@@ -12846,7 +12846,7 @@
               <w:rPr>
                 <w:b/>
               </w:rPr>
-              <w:t>Opmerking Medimo</w:t>
+              <w:t>Opmerking in Medimo</w:t>
             </w:r>
           </w:p>
         </w:tc>
@@ -12989,7 +12989,7 @@
               <w:rPr>
                 <w:b/>
               </w:rPr>
-              <w:t>Opmerking Medimo</w:t>
+              <w:t>Opmerking in Medimo</w:t>
             </w:r>
           </w:p>
         </w:tc>
@@ -13132,7 +13132,7 @@
               <w:rPr>
                 <w:b/>
               </w:rPr>
-              <w:t>Opmerking Medimo</w:t>
+              <w:t>Opmerking in Medimo</w:t>
             </w:r>
           </w:p>
         </w:tc>
@@ -13275,7 +13275,7 @@
               <w:rPr>
                 <w:b/>
               </w:rPr>
-              <w:t>Opmerking Medimo</w:t>
+              <w:t>Opmerking in Medimo</w:t>
             </w:r>
           </w:p>
         </w:tc>
@@ -13540,7 +13540,7 @@
               <w:rPr>
                 <w:b/>
               </w:rPr>
-              <w:t>Opmerking Medimo</w:t>
+              <w:t>Opmerking in Medimo</w:t>
             </w:r>
           </w:p>
         </w:tc>
@@ -13683,7 +13683,7 @@
               <w:rPr>
                 <w:b/>
               </w:rPr>
-              <w:t>Opmerking Medimo</w:t>
+              <w:t>Opmerking in Medimo</w:t>
             </w:r>
           </w:p>
         </w:tc>
@@ -13870,7 +13870,7 @@
               <w:rPr>
                 <w:b/>
               </w:rPr>
-              <w:t>Opmerking Medimo</w:t>
+              <w:t>Opmerking in Medimo</w:t>
             </w:r>
           </w:p>
         </w:tc>
@@ -14055,7 +14055,7 @@
               <w:rPr>
                 <w:b/>
               </w:rPr>
-              <w:t>Opmerking Medimo</w:t>
+              <w:t>Opmerking in Medimo</w:t>
             </w:r>
           </w:p>
         </w:tc>
@@ -14238,7 +14238,7 @@
               <w:rPr>
                 <w:b/>
               </w:rPr>
-              <w:t>Opmerking Medimo</w:t>
+              <w:t>Opmerking in Medimo</w:t>
             </w:r>
           </w:p>
         </w:tc>
@@ -14383,7 +14383,7 @@
               <w:rPr>
                 <w:b/>
               </w:rPr>
-              <w:t>Opmerking Medimo</w:t>
+              <w:t>Opmerking in Medimo</w:t>
             </w:r>
           </w:p>
         </w:tc>

</xml_diff>

<commit_message>
update start stopp function
</commit_message>
<xml_diff>
--- a/Output/MedicatieReview_Argusvlinder.docx
+++ b/Output/MedicatieReview_Argusvlinder.docx
@@ -89,7 +89,7 @@
         <w:rPr>
           <w:color w:val="000080"/>
         </w:rPr>
-        <w:t>Mogelijke dubbelmedicatie:</w:t>
+        <w:t>Mogelijke (pseudo)dubbelmedicatie:</w:t>
       </w:r>
     </w:p>
     <w:tbl>
@@ -1252,7 +1252,7 @@
         <w:rPr>
           <w:color w:val="000080"/>
         </w:rPr>
-        <w:t>Mogelijke dubbelmedicatie:</w:t>
+        <w:t>Mogelijke (pseudo)dubbelmedicatie:</w:t>
       </w:r>
     </w:p>
     <w:tbl>
@@ -2415,7 +2415,7 @@
         <w:rPr>
           <w:color w:val="000080"/>
         </w:rPr>
-        <w:t>Mogelijke dubbelmedicatie:</w:t>
+        <w:t>Mogelijke (pseudo)dubbelmedicatie:</w:t>
       </w:r>
     </w:p>
     <w:p>
@@ -3627,7 +3627,7 @@
         <w:rPr>
           <w:color w:val="000080"/>
         </w:rPr>
-        <w:t>Mogelijke dubbelmedicatie:</w:t>
+        <w:t>Mogelijke (pseudo)dubbelmedicatie:</w:t>
       </w:r>
     </w:p>
     <w:tbl>
@@ -5226,11 +5226,139 @@
         <w:t>Mogelijke STOPP-criteria:</w:t>
       </w:r>
     </w:p>
-    <w:p>
-      <w:r>
-        <w:t>Geen STOPP-criteria getriggerd.</w:t>
-      </w:r>
-    </w:p>
+    <w:tbl>
+      <w:tblPr>
+        <w:tblStyle w:val="TableGrid"/>
+        <w:tblW w:type="auto" w:w="0"/>
+        <w:tblLook w:firstColumn="1" w:firstRow="1" w:lastColumn="0" w:lastRow="0" w:noHBand="0" w:noVBand="1" w:val="04A0"/>
+      </w:tblPr>
+      <w:tblGrid>
+        <w:gridCol w:w="1872"/>
+        <w:gridCol w:w="1872"/>
+        <w:gridCol w:w="1872"/>
+        <w:gridCol w:w="1872"/>
+        <w:gridCol w:w="1872"/>
+      </w:tblGrid>
+      <w:tr>
+        <w:tc>
+          <w:tcPr>
+            <w:tcW w:type="dxa" w:w="1872"/>
+          </w:tcPr>
+          <w:p>
+            <w:r>
+              <w:rPr>
+                <w:b/>
+              </w:rPr>
+              <w:t>Criteriumcode</w:t>
+            </w:r>
+          </w:p>
+        </w:tc>
+        <w:tc>
+          <w:tcPr>
+            <w:tcW w:type="dxa" w:w="1872"/>
+          </w:tcPr>
+          <w:p>
+            <w:r>
+              <w:rPr>
+                <w:b/>
+              </w:rPr>
+              <w:t>Categorie</w:t>
+            </w:r>
+          </w:p>
+        </w:tc>
+        <w:tc>
+          <w:tcPr>
+            <w:tcW w:type="dxa" w:w="1872"/>
+          </w:tcPr>
+          <w:p>
+            <w:r>
+              <w:rPr>
+                <w:b/>
+              </w:rPr>
+              <w:t>Beschrijving</w:t>
+            </w:r>
+          </w:p>
+        </w:tc>
+        <w:tc>
+          <w:tcPr>
+            <w:tcW w:type="dxa" w:w="1872"/>
+          </w:tcPr>
+          <w:p>
+            <w:r>
+              <w:rPr>
+                <w:b/>
+              </w:rPr>
+              <w:t>Argument</w:t>
+            </w:r>
+          </w:p>
+        </w:tc>
+        <w:tc>
+          <w:tcPr>
+            <w:tcW w:type="dxa" w:w="1872"/>
+          </w:tcPr>
+          <w:p>
+            <w:r>
+              <w:rPr>
+                <w:b/>
+              </w:rPr>
+              <w:t>Getriggerd door</w:t>
+            </w:r>
+          </w:p>
+        </w:tc>
+      </w:tr>
+      <w:tr>
+        <w:tc>
+          <w:tcPr>
+            <w:tcW w:type="dxa" w:w="1872"/>
+          </w:tcPr>
+          <w:p>
+            <w:r>
+              <w:t>STOP B3</w:t>
+            </w:r>
+          </w:p>
+        </w:tc>
+        <w:tc>
+          <w:tcPr>
+            <w:tcW w:type="dxa" w:w="1872"/>
+          </w:tcPr>
+          <w:p>
+            <w:r>
+              <w:t>CARDIOVASCULAIR</w:t>
+            </w:r>
+          </w:p>
+        </w:tc>
+        <w:tc>
+          <w:tcPr>
+            <w:tcW w:type="dxa" w:w="1872"/>
+          </w:tcPr>
+          <w:p>
+            <w:r>
+              <w:t>Bètablokker bij bradycardie (&lt; 50/min), tweede-graads blok of compleet AV-blok. N.B. Dosis verlagen of stoppen</w:t>
+            </w:r>
+          </w:p>
+        </w:tc>
+        <w:tc>
+          <w:tcPr>
+            <w:tcW w:type="dxa" w:w="1872"/>
+          </w:tcPr>
+          <w:p>
+            <w:r>
+              <w:t>Risico op compleet hartblok, asystolie</w:t>
+            </w:r>
+          </w:p>
+        </w:tc>
+        <w:tc>
+          <w:tcPr>
+            <w:tcW w:type="dxa" w:w="1872"/>
+          </w:tcPr>
+          <w:p>
+            <w:r>
+              <w:t>Metoprolol tablet 50mg, Metoprolol tablet mga 25mg (succinaat)</w:t>
+            </w:r>
+          </w:p>
+        </w:tc>
+      </w:tr>
+    </w:tbl>
     <w:p>
       <w:pPr>
         <w:pStyle w:val="Heading3"/>
@@ -5240,7 +5368,7 @@
         <w:rPr>
           <w:color w:val="000080"/>
         </w:rPr>
-        <w:t>Mogelijke dubbelmedicatie:</w:t>
+        <w:t>Mogelijke (pseudo)dubbelmedicatie:</w:t>
       </w:r>
     </w:p>
     <w:tbl>
@@ -6571,7 +6699,7 @@
         <w:rPr>
           <w:color w:val="000080"/>
         </w:rPr>
-        <w:t>Mogelijke dubbelmedicatie:</w:t>
+        <w:t>Mogelijke (pseudo)dubbelmedicatie:</w:t>
       </w:r>
     </w:p>
     <w:tbl>
@@ -8314,7 +8442,7 @@
         <w:rPr>
           <w:color w:val="000080"/>
         </w:rPr>
-        <w:t>Mogelijke dubbelmedicatie:</w:t>
+        <w:t>Mogelijke (pseudo)dubbelmedicatie:</w:t>
       </w:r>
     </w:p>
     <w:tbl>
@@ -9519,7 +9647,7 @@
         <w:rPr>
           <w:color w:val="000080"/>
         </w:rPr>
-        <w:t>Mogelijke dubbelmedicatie:</w:t>
+        <w:t>Mogelijke (pseudo)dubbelmedicatie:</w:t>
       </w:r>
     </w:p>
     <w:tbl>
@@ -10519,7 +10647,7 @@
         <w:rPr>
           <w:color w:val="000080"/>
         </w:rPr>
-        <w:t>Mogelijke dubbelmedicatie:</w:t>
+        <w:t>Mogelijke (pseudo)dubbelmedicatie:</w:t>
       </w:r>
     </w:p>
     <w:tbl>
@@ -12549,7 +12677,7 @@
         <w:rPr>
           <w:color w:val="000080"/>
         </w:rPr>
-        <w:t>Mogelijke dubbelmedicatie:</w:t>
+        <w:t>Mogelijke (pseudo)dubbelmedicatie:</w:t>
       </w:r>
     </w:p>
     <w:tbl>

</xml_diff>